<commit_message>
Changs made in latest script
</commit_message>
<xml_diff>
--- a/helpingMaterial/latesttunningacript.docx
+++ b/helpingMaterial/latesttunningacript.docx
@@ -1,6 +1,6 @@
 
 <file path=word/document.xml><?xml version="1.0" encoding="utf-8"?>
-<w:document xmlns:wpc="http://schemas.microsoft.com/office/word/2010/wordprocessingCanvas" xmlns:cx="http://schemas.microsoft.com/office/drawing/2014/chartex" xmlns:cx1="http://schemas.microsoft.com/office/drawing/2015/9/8/chartex" xmlns:cx2="http://schemas.microsoft.com/office/drawing/2015/10/21/chartex" xmlns:cx3="http://schemas.microsoft.com/office/drawing/2016/5/9/chartex" xmlns:cx4="http://schemas.microsoft.com/office/drawing/2016/5/10/chartex" xmlns:cx5="http://schemas.microsoft.com/office/drawing/2016/5/11/chartex" xmlns:cx6="http://schemas.microsoft.com/office/drawing/2016/5/12/chartex" xmlns:cx7="http://schemas.microsoft.com/office/drawing/2016/5/13/chartex" xmlns:cx8="http://schemas.microsoft.com/office/drawing/2016/5/14/chartex" xmlns:mc="http://schemas.openxmlformats.org/markup-compatibility/2006" xmlns:aink="http://schemas.microsoft.com/office/drawing/2016/ink" xmlns:am3d="http://schemas.microsoft.com/office/drawing/2017/model3d" xmlns:o="urn:schemas-microsoft-com:office:office" xmlns:r="http://schemas.openxmlformats.org/officeDocument/2006/relationships" xmlns:m="http://schemas.openxmlformats.org/officeDocument/2006/math" xmlns:v="urn:schemas-microsoft-com:vml" xmlns:wp14="http://schemas.microsoft.com/office/word/2010/wordprocessingDrawing" xmlns:wp="http://schemas.openxmlformats.org/drawingml/2006/wordprocessingDrawing" xmlns:w10="urn:schemas-microsoft-com:office:word" xmlns:w="http://schemas.openxmlformats.org/wordprocessingml/2006/main" xmlns:w14="http://schemas.microsoft.com/office/word/2010/wordml" xmlns:w15="http://schemas.microsoft.com/office/word/2012/wordml" xmlns:w16cex="http://schemas.microsoft.com/office/word/2018/wordml/cex" xmlns:w16cid="http://schemas.microsoft.com/office/word/2016/wordml/cid" xmlns:w16="http://schemas.microsoft.com/office/word/2018/wordml" xmlns:w16sdtdh="http://schemas.microsoft.com/office/word/2020/wordml/sdtdatahash" xmlns:w16se="http://schemas.microsoft.com/office/word/2015/wordml/symex" xmlns:wpg="http://schemas.microsoft.com/office/word/2010/wordprocessingGroup" xmlns:wpi="http://schemas.microsoft.com/office/word/2010/wordprocessingInk" xmlns:wne="http://schemas.microsoft.com/office/word/2006/wordml" xmlns:wps="http://schemas.microsoft.com/office/word/2010/wordprocessingShape" mc:Ignorable="w14 w15 w16se w16cid w16 w16cex w16sdtdh wp14">
+<w:document xmlns:w="http://schemas.openxmlformats.org/wordprocessingml/2006/main" xmlns:r="http://schemas.openxmlformats.org/officeDocument/2006/relationships" xmlns:wps="http://schemas.microsoft.com/office/word/2010/wordprocessingShape" xmlns:mc="http://schemas.openxmlformats.org/markup-compatibility/2006" xmlns:w10="urn:schemas-microsoft-com:office:word" xmlns:v="urn:schemas-microsoft-com:vml" xmlns:wp14="http://schemas.microsoft.com/office/word/2010/wordprocessingDrawing" xmlns:wpg="http://schemas.microsoft.com/office/word/2010/wordprocessingGroup" xmlns:wpc="http://schemas.microsoft.com/office/word/2010/wordprocessingCanvas" xmlns:w14="http://schemas.microsoft.com/office/word/2010/wordml" xmlns:w15="http://schemas.microsoft.com/office/word/2012/wordml" xmlns:cx1="http://schemas.microsoft.com/office/drawing/2015/9/8/chartex" xmlns:cx2="http://schemas.microsoft.com/office/drawing/2015/10/21/chartex" mc:Ignorable="wp14 w14 w15">
   <w:body>
     <w:p>
       <w:r>
@@ -134,7 +134,6 @@
     </w:p>
     <w:p>
       <w:r>
-        <w:lastRenderedPageBreak/>
         <w:t xml:space="preserve">    DataCollatorForLanguageModeling,</w:t>
       </w:r>
     </w:p>
@@ -274,7 +273,6 @@
     </w:p>
     <w:p>
       <w:r>
-        <w:lastRenderedPageBreak/>
         <w:t xml:space="preserve">    "gradient_accumulation_steps": 16,  # micro_batch * accum = effective batch</w:t>
       </w:r>
     </w:p>
@@ -426,7 +424,6 @@
     </w:p>
     <w:p>
       <w:r>
-        <w:lastRenderedPageBreak/>
         <w:t xml:space="preserve">    parser.add_argument("--data_path", type=str, default=DEFAULT_CONFIG["data_path"])</w:t>
       </w:r>
     </w:p>
@@ -566,7 +563,6 @@
     </w:p>
     <w:p>
       <w:r>
-        <w:lastRenderedPageBreak/>
         <w:t xml:space="preserve">    if "instruction" in example and "output" in example:</w:t>
       </w:r>
     </w:p>
@@ -714,7 +710,6 @@
     </w:p>
     <w:p>
       <w:r>
-        <w:lastRenderedPageBreak/>
         <w:t xml:space="preserve">    """</w:t>
       </w:r>
     </w:p>
@@ -853,7 +848,6 @@
     <w:p/>
     <w:p>
       <w:r>
-        <w:lastRenderedPageBreak/>
         <w:t xml:space="preserve">    # -------------------- load/override config --------------------</w:t>
       </w:r>
     </w:p>
@@ -981,7 +975,6 @@
     </w:p>
     <w:p>
       <w:r>
-        <w:lastRenderedPageBreak/>
         <w:t xml:space="preserve">    val_count = max(1, int(total * val_ratio))</w:t>
       </w:r>
     </w:p>
@@ -1120,7 +1113,6 @@
     </w:p>
     <w:p>
       <w:r>
-        <w:lastRenderedPageBreak/>
         <w:t xml:space="preserve">        def __getitem__(self, idx):</w:t>
       </w:r>
     </w:p>
@@ -1255,7 +1247,6 @@
     </w:p>
     <w:p>
       <w:r>
-        <w:lastRenderedPageBreak/>
         <w:t xml:space="preserve">    model = prepare_model_for_kbit_training(model)</w:t>
       </w:r>
     </w:p>
@@ -1395,7 +1386,6 @@
     </w:p>
     <w:p>
       <w:r>
-        <w:lastRenderedPageBreak/>
         <w:t xml:space="preserve">        eval_steps=config["eval_steps"],</w:t>
       </w:r>
     </w:p>
@@ -1543,7 +1533,6 @@
     </w:p>
     <w:p>
       <w:r>
-        <w:lastRenderedPageBreak/>
         <w:t xml:space="preserve">            optim_cls = None</w:t>
       </w:r>
     </w:p>
@@ -1683,7 +1672,6 @@
     </w:p>
     <w:p>
       <w:r>
-        <w:lastRenderedPageBreak/>
         <w:t xml:space="preserve">    print("Starting training...")</w:t>
       </w:r>
     </w:p>
@@ -1819,7 +1807,6 @@
     </w:p>
     <w:p>
       <w:r>
-        <w:lastRenderedPageBreak/>
         <w:t xml:space="preserve">    np.save(os.path.join(config["output_dir"], "eval_steps.npy"), np.array(eval_steps))</w:t>
       </w:r>
     </w:p>
@@ -1958,7 +1945,6 @@
     </w:p>
     <w:p>
       <w:r>
-        <w:lastRenderedPageBreak/>
         <w:t xml:space="preserve">    if torch.cuda.is_available():</w:t>
       </w:r>
     </w:p>
@@ -2097,7 +2083,6 @@
     </w:p>
     <w:p>
       <w:r>
-        <w:lastRenderedPageBreak/>
         <w:t xml:space="preserve">    print("You can inspect tensorboard logs in:", tb_log_dir)</w:t>
       </w:r>
     </w:p>
@@ -2112,426 +2097,151 @@
         <w:t xml:space="preserve">    main()</w:t>
       </w:r>
     </w:p>
+    <w:p/>
+    <w:p/>
+    <w:p/>
+    <w:p/>
+    <w:p/>
+    <w:p>
+      <w:r>
+        <w:t># Basic</w:t>
+      </w:r>
+    </w:p>
+    <w:p>
+      <w:r>
+        <w:t>pip install --upgrade pip setuptools wheel</w:t>
+      </w:r>
+    </w:p>
+    <w:p/>
+    <w:p>
+      <w:r>
+        <w:t># Transformers, Datasets, accelerate</w:t>
+      </w:r>
+    </w:p>
+    <w:p>
+      <w:r>
+        <w:t>pip install transformers datasets accelerate</w:t>
+      </w:r>
+    </w:p>
+    <w:p/>
+    <w:p>
+      <w:r>
+        <w:t># bitsandbytes (for 4-bit &amp; 8-bit)</w:t>
+      </w:r>
+    </w:p>
+    <w:p>
+      <w:r>
+        <w:t>pip install bitsandbytes</w:t>
+      </w:r>
+    </w:p>
+    <w:p/>
+    <w:p>
+      <w:r>
+        <w:t># PEFT (LoRA utilities)</w:t>
+      </w:r>
+    </w:p>
+    <w:p>
+      <w:r>
+        <w:t>pip install peft</w:t>
+      </w:r>
+    </w:p>
+    <w:p/>
+    <w:p>
+      <w:r>
+        <w:t># Optional (Trainer logging)</w:t>
+      </w:r>
+    </w:p>
+    <w:p>
+      <w:r>
+        <w:t>pip install tensorboard matplotlib</w:t>
+      </w:r>
+    </w:p>
+    <w:p/>
+    <w:p>
+      <w:r>
+        <w:t># Optional (WandB)</w:t>
+      </w:r>
+    </w:p>
+    <w:p>
+      <w:r>
+        <w:t>pip install wandb</w:t>
+      </w:r>
+    </w:p>
+    <w:p>
+      <w:r>
+        <w:t>pip install rouge-score nltk</w:t>
+      </w:r>
+    </w:p>
+    <w:p/>
     <w:sectPr>
-      <w:pgSz w:w="11906" w:h="16838"/>
-      <w:pgMar w:top="1440" w:right="1440" w:bottom="1440" w:left="1440" w:header="708" w:footer="708" w:gutter="0"/>
-      <w:cols w:space="708"/>
-      <w:docGrid w:linePitch="360"/>
+      <w:type w:val="nextPage"/>
+      <w:pgSz w:w="11906" w:h="16838" w:code="0"/>
+      <w:pgMar w:left="1440" w:right="1440" w:top="1440" w:bottom="1440" w:header="708" w:footer="708" w:gutter="0"/>
     </w:sectPr>
   </w:body>
 </w:document>
 </file>
 
+<file path=word/numbering.xml><?xml version="1.0" encoding="utf-8"?>
+<w:numbering xmlns:w="http://schemas.openxmlformats.org/wordprocessingml/2006/main"/>
+</file>
+
 <file path=word/styles.xml><?xml version="1.0" encoding="utf-8"?>
-<w:styles xmlns:mc="http://schemas.openxmlformats.org/markup-compatibility/2006" xmlns:r="http://schemas.openxmlformats.org/officeDocument/2006/relationships" xmlns:w="http://schemas.openxmlformats.org/wordprocessingml/2006/main" xmlns:w14="http://schemas.microsoft.com/office/word/2010/wordml" xmlns:w15="http://schemas.microsoft.com/office/word/2012/wordml" xmlns:w16cex="http://schemas.microsoft.com/office/word/2018/wordml/cex" xmlns:w16cid="http://schemas.microsoft.com/office/word/2016/wordml/cid" xmlns:w16="http://schemas.microsoft.com/office/word/2018/wordml" xmlns:w16sdtdh="http://schemas.microsoft.com/office/word/2020/wordml/sdtdatahash" xmlns:w16se="http://schemas.microsoft.com/office/word/2015/wordml/symex" mc:Ignorable="w14 w15 w16se w16cid w16 w16cex w16sdtdh">
+<w:styles xmlns:w="http://schemas.openxmlformats.org/wordprocessingml/2006/main">
   <w:docDefaults>
     <w:rPrDefault>
       <w:rPr>
-        <w:rFonts w:asciiTheme="minorHAnsi" w:eastAsiaTheme="minorHAnsi" w:hAnsiTheme="minorHAnsi" w:cstheme="minorBidi"/>
+        <w:rFonts w:asciiTheme="minorHAnsi" w:hAnsiTheme="minorHAnsi" w:cstheme="minorBidi" w:eastAsiaTheme="minorHAnsi"/>
         <w:sz w:val="22"/>
         <w:szCs w:val="22"/>
-        <w:lang w:val="en-PK" w:eastAsia="en-US" w:bidi="ar-SA"/>
+        <w:lang w:val="en-PK" w:bidi="ar-SA" w:eastAsia="en-US"/>
       </w:rPr>
     </w:rPrDefault>
     <w:pPrDefault>
       <w:pPr>
-        <w:spacing w:after="160" w:line="259" w:lineRule="auto"/>
+        <w:keepNext w:val="0"/>
+        <w:keepLines w:val="0"/>
+        <w:pageBreakBefore w:val="0"/>
+        <w:widowControl w:val="1"/>
+        <w:suppressLineNumbers w:val="0"/>
+        <w:shd w:val="clear" w:fill="auto"/>
+        <w:suppressAutoHyphens w:val="0"/>
+        <w:spacing w:lineRule="auto" w:line="259" w:before="0" w:after="160" w:beforeAutospacing="0" w:afterAutospacing="0"/>
+        <w:ind w:firstLine="0" w:left="0" w:right="0"/>
+        <w:contextualSpacing w:val="0"/>
+        <w:bidi w:val="0"/>
+        <w:jc w:val="left"/>
+        <w:outlineLvl w:val="9"/>
       </w:pPr>
     </w:pPrDefault>
   </w:docDefaults>
-  <w:latentStyles w:defLockedState="0" w:defUIPriority="99" w:defSemiHidden="0" w:defUnhideWhenUsed="0" w:defQFormat="0" w:count="376">
-    <w:lsdException w:name="Normal" w:uiPriority="0" w:qFormat="1"/>
-    <w:lsdException w:name="heading 1" w:uiPriority="9" w:qFormat="1"/>
-    <w:lsdException w:name="heading 2" w:semiHidden="1" w:uiPriority="9" w:unhideWhenUsed="1" w:qFormat="1"/>
-    <w:lsdException w:name="heading 3" w:semiHidden="1" w:uiPriority="9" w:unhideWhenUsed="1" w:qFormat="1"/>
-    <w:lsdException w:name="heading 4" w:semiHidden="1" w:uiPriority="9" w:unhideWhenUsed="1" w:qFormat="1"/>
-    <w:lsdException w:name="heading 5" w:semiHidden="1" w:uiPriority="9" w:unhideWhenUsed="1" w:qFormat="1"/>
-    <w:lsdException w:name="heading 6" w:semiHidden="1" w:uiPriority="9" w:unhideWhenUsed="1" w:qFormat="1"/>
-    <w:lsdException w:name="heading 7" w:semiHidden="1" w:uiPriority="9" w:unhideWhenUsed="1" w:qFormat="1"/>
-    <w:lsdException w:name="heading 8" w:semiHidden="1" w:uiPriority="9" w:unhideWhenUsed="1" w:qFormat="1"/>
-    <w:lsdException w:name="heading 9" w:semiHidden="1" w:uiPriority="9" w:unhideWhenUsed="1" w:qFormat="1"/>
-    <w:lsdException w:name="index 1" w:semiHidden="1" w:unhideWhenUsed="1"/>
-    <w:lsdException w:name="index 2" w:semiHidden="1" w:unhideWhenUsed="1"/>
-    <w:lsdException w:name="index 3" w:semiHidden="1" w:unhideWhenUsed="1"/>
-    <w:lsdException w:name="index 4" w:semiHidden="1" w:unhideWhenUsed="1"/>
-    <w:lsdException w:name="index 5" w:semiHidden="1" w:unhideWhenUsed="1"/>
-    <w:lsdException w:name="index 6" w:semiHidden="1" w:unhideWhenUsed="1"/>
-    <w:lsdException w:name="index 7" w:semiHidden="1" w:unhideWhenUsed="1"/>
-    <w:lsdException w:name="index 8" w:semiHidden="1" w:unhideWhenUsed="1"/>
-    <w:lsdException w:name="index 9" w:semiHidden="1" w:unhideWhenUsed="1"/>
-    <w:lsdException w:name="toc 1" w:semiHidden="1" w:uiPriority="39" w:unhideWhenUsed="1"/>
-    <w:lsdException w:name="toc 2" w:semiHidden="1" w:uiPriority="39" w:unhideWhenUsed="1"/>
-    <w:lsdException w:name="toc 3" w:semiHidden="1" w:uiPriority="39" w:unhideWhenUsed="1"/>
-    <w:lsdException w:name="toc 4" w:semiHidden="1" w:uiPriority="39" w:unhideWhenUsed="1"/>
-    <w:lsdException w:name="toc 5" w:semiHidden="1" w:uiPriority="39" w:unhideWhenUsed="1"/>
-    <w:lsdException w:name="toc 6" w:semiHidden="1" w:uiPriority="39" w:unhideWhenUsed="1"/>
-    <w:lsdException w:name="toc 7" w:semiHidden="1" w:uiPriority="39" w:unhideWhenUsed="1"/>
-    <w:lsdException w:name="toc 8" w:semiHidden="1" w:uiPriority="39" w:unhideWhenUsed="1"/>
-    <w:lsdException w:name="toc 9" w:semiHidden="1" w:uiPriority="39" w:unhideWhenUsed="1"/>
-    <w:lsdException w:name="Normal Indent" w:semiHidden="1" w:unhideWhenUsed="1"/>
-    <w:lsdException w:name="footnote text" w:semiHidden="1" w:unhideWhenUsed="1"/>
-    <w:lsdException w:name="annotation text" w:semiHidden="1" w:unhideWhenUsed="1"/>
-    <w:lsdException w:name="header" w:semiHidden="1" w:unhideWhenUsed="1"/>
-    <w:lsdException w:name="footer" w:semiHidden="1" w:unhideWhenUsed="1"/>
-    <w:lsdException w:name="index heading" w:semiHidden="1" w:unhideWhenUsed="1"/>
-    <w:lsdException w:name="caption" w:semiHidden="1" w:uiPriority="35" w:unhideWhenUsed="1" w:qFormat="1"/>
-    <w:lsdException w:name="table of figures" w:semiHidden="1" w:unhideWhenUsed="1"/>
-    <w:lsdException w:name="envelope address" w:semiHidden="1" w:unhideWhenUsed="1"/>
-    <w:lsdException w:name="envelope return" w:semiHidden="1" w:unhideWhenUsed="1"/>
-    <w:lsdException w:name="footnote reference" w:semiHidden="1" w:unhideWhenUsed="1"/>
-    <w:lsdException w:name="annotation reference" w:semiHidden="1" w:unhideWhenUsed="1"/>
-    <w:lsdException w:name="line number" w:semiHidden="1" w:unhideWhenUsed="1"/>
-    <w:lsdException w:name="page number" w:semiHidden="1" w:unhideWhenUsed="1"/>
-    <w:lsdException w:name="endnote reference" w:semiHidden="1" w:unhideWhenUsed="1"/>
-    <w:lsdException w:name="endnote text" w:semiHidden="1" w:unhideWhenUsed="1"/>
-    <w:lsdException w:name="table of authorities" w:semiHidden="1" w:unhideWhenUsed="1"/>
-    <w:lsdException w:name="macro" w:semiHidden="1" w:unhideWhenUsed="1"/>
-    <w:lsdException w:name="toa heading" w:semiHidden="1" w:unhideWhenUsed="1"/>
-    <w:lsdException w:name="List" w:semiHidden="1" w:unhideWhenUsed="1"/>
-    <w:lsdException w:name="List Bullet" w:semiHidden="1" w:unhideWhenUsed="1"/>
-    <w:lsdException w:name="List Number" w:semiHidden="1" w:unhideWhenUsed="1"/>
-    <w:lsdException w:name="List 2" w:semiHidden="1" w:unhideWhenUsed="1"/>
-    <w:lsdException w:name="List 3" w:semiHidden="1" w:unhideWhenUsed="1"/>
-    <w:lsdException w:name="List 4" w:semiHidden="1" w:unhideWhenUsed="1"/>
-    <w:lsdException w:name="List 5" w:semiHidden="1" w:unhideWhenUsed="1"/>
-    <w:lsdException w:name="List Bullet 2" w:semiHidden="1" w:unhideWhenUsed="1"/>
-    <w:lsdException w:name="List Bullet 3" w:semiHidden="1" w:unhideWhenUsed="1"/>
-    <w:lsdException w:name="List Bullet 4" w:semiHidden="1" w:unhideWhenUsed="1"/>
-    <w:lsdException w:name="List Bullet 5" w:semiHidden="1" w:unhideWhenUsed="1"/>
-    <w:lsdException w:name="List Number 2" w:semiHidden="1" w:unhideWhenUsed="1"/>
-    <w:lsdException w:name="List Number 3" w:semiHidden="1" w:unhideWhenUsed="1"/>
-    <w:lsdException w:name="List Number 4" w:semiHidden="1" w:unhideWhenUsed="1"/>
-    <w:lsdException w:name="List Number 5" w:semiHidden="1" w:unhideWhenUsed="1"/>
-    <w:lsdException w:name="Title" w:uiPriority="10" w:qFormat="1"/>
-    <w:lsdException w:name="Closing" w:semiHidden="1" w:unhideWhenUsed="1"/>
-    <w:lsdException w:name="Signature" w:semiHidden="1" w:unhideWhenUsed="1"/>
-    <w:lsdException w:name="Default Paragraph Font" w:semiHidden="1" w:uiPriority="1" w:unhideWhenUsed="1"/>
-    <w:lsdException w:name="Body Text" w:semiHidden="1" w:unhideWhenUsed="1"/>
-    <w:lsdException w:name="Body Text Indent" w:semiHidden="1" w:unhideWhenUsed="1"/>
-    <w:lsdException w:name="List Continue" w:semiHidden="1" w:unhideWhenUsed="1"/>
-    <w:lsdException w:name="List Continue 2" w:semiHidden="1" w:unhideWhenUsed="1"/>
-    <w:lsdException w:name="List Continue 3" w:semiHidden="1" w:unhideWhenUsed="1"/>
-    <w:lsdException w:name="List Continue 4" w:semiHidden="1" w:unhideWhenUsed="1"/>
-    <w:lsdException w:name="List Continue 5" w:semiHidden="1" w:unhideWhenUsed="1"/>
-    <w:lsdException w:name="Message Header" w:semiHidden="1" w:unhideWhenUsed="1"/>
-    <w:lsdException w:name="Subtitle" w:uiPriority="11" w:qFormat="1"/>
-    <w:lsdException w:name="Salutation" w:semiHidden="1" w:unhideWhenUsed="1"/>
-    <w:lsdException w:name="Date" w:semiHidden="1" w:unhideWhenUsed="1"/>
-    <w:lsdException w:name="Body Text First Indent" w:semiHidden="1" w:unhideWhenUsed="1"/>
-    <w:lsdException w:name="Body Text First Indent 2" w:semiHidden="1" w:unhideWhenUsed="1"/>
-    <w:lsdException w:name="Note Heading" w:semiHidden="1" w:unhideWhenUsed="1"/>
-    <w:lsdException w:name="Body Text 2" w:semiHidden="1" w:unhideWhenUsed="1"/>
-    <w:lsdException w:name="Body Text 3" w:semiHidden="1" w:unhideWhenUsed="1"/>
-    <w:lsdException w:name="Body Text Indent 2" w:semiHidden="1" w:unhideWhenUsed="1"/>
-    <w:lsdException w:name="Body Text Indent 3" w:semiHidden="1" w:unhideWhenUsed="1"/>
-    <w:lsdException w:name="Block Text" w:semiHidden="1" w:unhideWhenUsed="1"/>
-    <w:lsdException w:name="Hyperlink" w:semiHidden="1" w:unhideWhenUsed="1"/>
-    <w:lsdException w:name="FollowedHyperlink" w:semiHidden="1" w:unhideWhenUsed="1"/>
-    <w:lsdException w:name="Strong" w:uiPriority="22" w:qFormat="1"/>
-    <w:lsdException w:name="Emphasis" w:uiPriority="20" w:qFormat="1"/>
-    <w:lsdException w:name="Document Map" w:semiHidden="1" w:unhideWhenUsed="1"/>
-    <w:lsdException w:name="Plain Text" w:semiHidden="1" w:unhideWhenUsed="1"/>
-    <w:lsdException w:name="E-mail Signature" w:semiHidden="1" w:unhideWhenUsed="1"/>
-    <w:lsdException w:name="HTML Top of Form" w:semiHidden="1" w:unhideWhenUsed="1"/>
-    <w:lsdException w:name="HTML Bottom of Form" w:semiHidden="1" w:unhideWhenUsed="1"/>
-    <w:lsdException w:name="Normal (Web)" w:semiHidden="1" w:unhideWhenUsed="1"/>
-    <w:lsdException w:name="HTML Acronym" w:semiHidden="1" w:unhideWhenUsed="1"/>
-    <w:lsdException w:name="HTML Address" w:semiHidden="1" w:unhideWhenUsed="1"/>
-    <w:lsdException w:name="HTML Cite" w:semiHidden="1" w:unhideWhenUsed="1"/>
-    <w:lsdException w:name="HTML Code" w:semiHidden="1" w:unhideWhenUsed="1"/>
-    <w:lsdException w:name="HTML Definition" w:semiHidden="1" w:unhideWhenUsed="1"/>
-    <w:lsdException w:name="HTML Keyboard" w:semiHidden="1" w:unhideWhenUsed="1"/>
-    <w:lsdException w:name="HTML Preformatted" w:semiHidden="1" w:unhideWhenUsed="1"/>
-    <w:lsdException w:name="HTML Sample" w:semiHidden="1" w:unhideWhenUsed="1"/>
-    <w:lsdException w:name="HTML Typewriter" w:semiHidden="1" w:unhideWhenUsed="1"/>
-    <w:lsdException w:name="HTML Variable" w:semiHidden="1" w:unhideWhenUsed="1"/>
-    <w:lsdException w:name="Normal Table" w:semiHidden="1" w:unhideWhenUsed="1"/>
-    <w:lsdException w:name="annotation subject" w:semiHidden="1" w:unhideWhenUsed="1"/>
-    <w:lsdException w:name="No List" w:semiHidden="1" w:unhideWhenUsed="1"/>
-    <w:lsdException w:name="Outline List 1" w:semiHidden="1" w:unhideWhenUsed="1"/>
-    <w:lsdException w:name="Outline List 2" w:semiHidden="1" w:unhideWhenUsed="1"/>
-    <w:lsdException w:name="Outline List 3" w:semiHidden="1" w:unhideWhenUsed="1"/>
-    <w:lsdException w:name="Table Simple 1" w:semiHidden="1" w:unhideWhenUsed="1"/>
-    <w:lsdException w:name="Table Simple 2" w:semiHidden="1" w:unhideWhenUsed="1"/>
-    <w:lsdException w:name="Table Simple 3" w:semiHidden="1" w:unhideWhenUsed="1"/>
-    <w:lsdException w:name="Table Classic 1" w:semiHidden="1" w:unhideWhenUsed="1"/>
-    <w:lsdException w:name="Table Classic 2" w:semiHidden="1" w:unhideWhenUsed="1"/>
-    <w:lsdException w:name="Table Classic 3" w:semiHidden="1" w:unhideWhenUsed="1"/>
-    <w:lsdException w:name="Table Classic 4" w:semiHidden="1" w:unhideWhenUsed="1"/>
-    <w:lsdException w:name="Table Colorful 1" w:semiHidden="1" w:unhideWhenUsed="1"/>
-    <w:lsdException w:name="Table Colorful 2" w:semiHidden="1" w:unhideWhenUsed="1"/>
-    <w:lsdException w:name="Table Colorful 3" w:semiHidden="1" w:unhideWhenUsed="1"/>
-    <w:lsdException w:name="Table Columns 1" w:semiHidden="1" w:unhideWhenUsed="1"/>
-    <w:lsdException w:name="Table Columns 2" w:semiHidden="1" w:unhideWhenUsed="1"/>
-    <w:lsdException w:name="Table Columns 3" w:semiHidden="1" w:unhideWhenUsed="1"/>
-    <w:lsdException w:name="Table Columns 4" w:semiHidden="1" w:unhideWhenUsed="1"/>
-    <w:lsdException w:name="Table Columns 5" w:semiHidden="1" w:unhideWhenUsed="1"/>
-    <w:lsdException w:name="Table Grid 1" w:semiHidden="1" w:unhideWhenUsed="1"/>
-    <w:lsdException w:name="Table Grid 2" w:semiHidden="1" w:unhideWhenUsed="1"/>
-    <w:lsdException w:name="Table Grid 3" w:semiHidden="1" w:unhideWhenUsed="1"/>
-    <w:lsdException w:name="Table Grid 4" w:semiHidden="1" w:unhideWhenUsed="1"/>
-    <w:lsdException w:name="Table Grid 5" w:semiHidden="1" w:unhideWhenUsed="1"/>
-    <w:lsdException w:name="Table Grid 6" w:semiHidden="1" w:unhideWhenUsed="1"/>
-    <w:lsdException w:name="Table Grid 7" w:semiHidden="1" w:unhideWhenUsed="1"/>
-    <w:lsdException w:name="Table Grid 8" w:semiHidden="1" w:unhideWhenUsed="1"/>
-    <w:lsdException w:name="Table List 1" w:semiHidden="1" w:unhideWhenUsed="1"/>
-    <w:lsdException w:name="Table List 2" w:semiHidden="1" w:unhideWhenUsed="1"/>
-    <w:lsdException w:name="Table List 3" w:semiHidden="1" w:unhideWhenUsed="1"/>
-    <w:lsdException w:name="Table List 4" w:semiHidden="1" w:unhideWhenUsed="1"/>
-    <w:lsdException w:name="Table List 5" w:semiHidden="1" w:unhideWhenUsed="1"/>
-    <w:lsdException w:name="Table List 6" w:semiHidden="1" w:unhideWhenUsed="1"/>
-    <w:lsdException w:name="Table List 7" w:semiHidden="1" w:unhideWhenUsed="1"/>
-    <w:lsdException w:name="Table List 8" w:semiHidden="1" w:unhideWhenUsed="1"/>
-    <w:lsdException w:name="Table 3D effects 1" w:semiHidden="1" w:unhideWhenUsed="1"/>
-    <w:lsdException w:name="Table 3D effects 2" w:semiHidden="1" w:unhideWhenUsed="1"/>
-    <w:lsdException w:name="Table 3D effects 3" w:semiHidden="1" w:unhideWhenUsed="1"/>
-    <w:lsdException w:name="Table Contemporary" w:semiHidden="1" w:unhideWhenUsed="1"/>
-    <w:lsdException w:name="Table Elegant" w:semiHidden="1" w:unhideWhenUsed="1"/>
-    <w:lsdException w:name="Table Professional" w:semiHidden="1" w:unhideWhenUsed="1"/>
-    <w:lsdException w:name="Table Subtle 1" w:semiHidden="1" w:unhideWhenUsed="1"/>
-    <w:lsdException w:name="Table Subtle 2" w:semiHidden="1" w:unhideWhenUsed="1"/>
-    <w:lsdException w:name="Table Web 1" w:semiHidden="1" w:unhideWhenUsed="1"/>
-    <w:lsdException w:name="Table Web 2" w:semiHidden="1" w:unhideWhenUsed="1"/>
-    <w:lsdException w:name="Table Web 3" w:semiHidden="1" w:unhideWhenUsed="1"/>
-    <w:lsdException w:name="Balloon Text" w:semiHidden="1" w:unhideWhenUsed="1"/>
-    <w:lsdException w:name="Table Grid" w:uiPriority="39"/>
-    <w:lsdException w:name="Table Theme" w:semiHidden="1" w:unhideWhenUsed="1"/>
-    <w:lsdException w:name="Placeholder Text" w:semiHidden="1"/>
-    <w:lsdException w:name="No Spacing" w:uiPriority="1" w:qFormat="1"/>
-    <w:lsdException w:name="Light Shading" w:uiPriority="60"/>
-    <w:lsdException w:name="Light List" w:uiPriority="61"/>
-    <w:lsdException w:name="Light Grid" w:uiPriority="62"/>
-    <w:lsdException w:name="Medium Shading 1" w:uiPriority="63"/>
-    <w:lsdException w:name="Medium Shading 2" w:uiPriority="64"/>
-    <w:lsdException w:name="Medium List 1" w:uiPriority="65"/>
-    <w:lsdException w:name="Medium List 2" w:uiPriority="66"/>
-    <w:lsdException w:name="Medium Grid 1" w:uiPriority="67"/>
-    <w:lsdException w:name="Medium Grid 2" w:uiPriority="68"/>
-    <w:lsdException w:name="Medium Grid 3" w:uiPriority="69"/>
-    <w:lsdException w:name="Dark List" w:uiPriority="70"/>
-    <w:lsdException w:name="Colorful Shading" w:uiPriority="71"/>
-    <w:lsdException w:name="Colorful List" w:uiPriority="72"/>
-    <w:lsdException w:name="Colorful Grid" w:uiPriority="73"/>
-    <w:lsdException w:name="Light Shading Accent 1" w:uiPriority="60"/>
-    <w:lsdException w:name="Light List Accent 1" w:uiPriority="61"/>
-    <w:lsdException w:name="Light Grid Accent 1" w:uiPriority="62"/>
-    <w:lsdException w:name="Medium Shading 1 Accent 1" w:uiPriority="63"/>
-    <w:lsdException w:name="Medium Shading 2 Accent 1" w:uiPriority="64"/>
-    <w:lsdException w:name="Medium List 1 Accent 1" w:uiPriority="65"/>
-    <w:lsdException w:name="Revision" w:semiHidden="1"/>
-    <w:lsdException w:name="List Paragraph" w:uiPriority="34" w:qFormat="1"/>
-    <w:lsdException w:name="Quote" w:uiPriority="29" w:qFormat="1"/>
-    <w:lsdException w:name="Intense Quote" w:uiPriority="30" w:qFormat="1"/>
-    <w:lsdException w:name="Medium List 2 Accent 1" w:uiPriority="66"/>
-    <w:lsdException w:name="Medium Grid 1 Accent 1" w:uiPriority="67"/>
-    <w:lsdException w:name="Medium Grid 2 Accent 1" w:uiPriority="68"/>
-    <w:lsdException w:name="Medium Grid 3 Accent 1" w:uiPriority="69"/>
-    <w:lsdException w:name="Dark List Accent 1" w:uiPriority="70"/>
-    <w:lsdException w:name="Colorful Shading Accent 1" w:uiPriority="71"/>
-    <w:lsdException w:name="Colorful List Accent 1" w:uiPriority="72"/>
-    <w:lsdException w:name="Colorful Grid Accent 1" w:uiPriority="73"/>
-    <w:lsdException w:name="Light Shading Accent 2" w:uiPriority="60"/>
-    <w:lsdException w:name="Light List Accent 2" w:uiPriority="61"/>
-    <w:lsdException w:name="Light Grid Accent 2" w:uiPriority="62"/>
-    <w:lsdException w:name="Medium Shading 1 Accent 2" w:uiPriority="63"/>
-    <w:lsdException w:name="Medium Shading 2 Accent 2" w:uiPriority="64"/>
-    <w:lsdException w:name="Medium List 1 Accent 2" w:uiPriority="65"/>
-    <w:lsdException w:name="Medium List 2 Accent 2" w:uiPriority="66"/>
-    <w:lsdException w:name="Medium Grid 1 Accent 2" w:uiPriority="67"/>
-    <w:lsdException w:name="Medium Grid 2 Accent 2" w:uiPriority="68"/>
-    <w:lsdException w:name="Medium Grid 3 Accent 2" w:uiPriority="69"/>
-    <w:lsdException w:name="Dark List Accent 2" w:uiPriority="70"/>
-    <w:lsdException w:name="Colorful Shading Accent 2" w:uiPriority="71"/>
-    <w:lsdException w:name="Colorful List Accent 2" w:uiPriority="72"/>
-    <w:lsdException w:name="Colorful Grid Accent 2" w:uiPriority="73"/>
-    <w:lsdException w:name="Light Shading Accent 3" w:uiPriority="60"/>
-    <w:lsdException w:name="Light List Accent 3" w:uiPriority="61"/>
-    <w:lsdException w:name="Light Grid Accent 3" w:uiPriority="62"/>
-    <w:lsdException w:name="Medium Shading 1 Accent 3" w:uiPriority="63"/>
-    <w:lsdException w:name="Medium Shading 2 Accent 3" w:uiPriority="64"/>
-    <w:lsdException w:name="Medium List 1 Accent 3" w:uiPriority="65"/>
-    <w:lsdException w:name="Medium List 2 Accent 3" w:uiPriority="66"/>
-    <w:lsdException w:name="Medium Grid 1 Accent 3" w:uiPriority="67"/>
-    <w:lsdException w:name="Medium Grid 2 Accent 3" w:uiPriority="68"/>
-    <w:lsdException w:name="Medium Grid 3 Accent 3" w:uiPriority="69"/>
-    <w:lsdException w:name="Dark List Accent 3" w:uiPriority="70"/>
-    <w:lsdException w:name="Colorful Shading Accent 3" w:uiPriority="71"/>
-    <w:lsdException w:name="Colorful List Accent 3" w:uiPriority="72"/>
-    <w:lsdException w:name="Colorful Grid Accent 3" w:uiPriority="73"/>
-    <w:lsdException w:name="Light Shading Accent 4" w:uiPriority="60"/>
-    <w:lsdException w:name="Light List Accent 4" w:uiPriority="61"/>
-    <w:lsdException w:name="Light Grid Accent 4" w:uiPriority="62"/>
-    <w:lsdException w:name="Medium Shading 1 Accent 4" w:uiPriority="63"/>
-    <w:lsdException w:name="Medium Shading 2 Accent 4" w:uiPriority="64"/>
-    <w:lsdException w:name="Medium List 1 Accent 4" w:uiPriority="65"/>
-    <w:lsdException w:name="Medium List 2 Accent 4" w:uiPriority="66"/>
-    <w:lsdException w:name="Medium Grid 1 Accent 4" w:uiPriority="67"/>
-    <w:lsdException w:name="Medium Grid 2 Accent 4" w:uiPriority="68"/>
-    <w:lsdException w:name="Medium Grid 3 Accent 4" w:uiPriority="69"/>
-    <w:lsdException w:name="Dark List Accent 4" w:uiPriority="70"/>
-    <w:lsdException w:name="Colorful Shading Accent 4" w:uiPriority="71"/>
-    <w:lsdException w:name="Colorful List Accent 4" w:uiPriority="72"/>
-    <w:lsdException w:name="Colorful Grid Accent 4" w:uiPriority="73"/>
-    <w:lsdException w:name="Light Shading Accent 5" w:uiPriority="60"/>
-    <w:lsdException w:name="Light List Accent 5" w:uiPriority="61"/>
-    <w:lsdException w:name="Light Grid Accent 5" w:uiPriority="62"/>
-    <w:lsdException w:name="Medium Shading 1 Accent 5" w:uiPriority="63"/>
-    <w:lsdException w:name="Medium Shading 2 Accent 5" w:uiPriority="64"/>
-    <w:lsdException w:name="Medium List 1 Accent 5" w:uiPriority="65"/>
-    <w:lsdException w:name="Medium List 2 Accent 5" w:uiPriority="66"/>
-    <w:lsdException w:name="Medium Grid 1 Accent 5" w:uiPriority="67"/>
-    <w:lsdException w:name="Medium Grid 2 Accent 5" w:uiPriority="68"/>
-    <w:lsdException w:name="Medium Grid 3 Accent 5" w:uiPriority="69"/>
-    <w:lsdException w:name="Dark List Accent 5" w:uiPriority="70"/>
-    <w:lsdException w:name="Colorful Shading Accent 5" w:uiPriority="71"/>
-    <w:lsdException w:name="Colorful List Accent 5" w:uiPriority="72"/>
-    <w:lsdException w:name="Colorful Grid Accent 5" w:uiPriority="73"/>
-    <w:lsdException w:name="Light Shading Accent 6" w:uiPriority="60"/>
-    <w:lsdException w:name="Light List Accent 6" w:uiPriority="61"/>
-    <w:lsdException w:name="Light Grid Accent 6" w:uiPriority="62"/>
-    <w:lsdException w:name="Medium Shading 1 Accent 6" w:uiPriority="63"/>
-    <w:lsdException w:name="Medium Shading 2 Accent 6" w:uiPriority="64"/>
-    <w:lsdException w:name="Medium List 1 Accent 6" w:uiPriority="65"/>
-    <w:lsdException w:name="Medium List 2 Accent 6" w:uiPriority="66"/>
-    <w:lsdException w:name="Medium Grid 1 Accent 6" w:uiPriority="67"/>
-    <w:lsdException w:name="Medium Grid 2 Accent 6" w:uiPriority="68"/>
-    <w:lsdException w:name="Medium Grid 3 Accent 6" w:uiPriority="69"/>
-    <w:lsdException w:name="Dark List Accent 6" w:uiPriority="70"/>
-    <w:lsdException w:name="Colorful Shading Accent 6" w:uiPriority="71"/>
-    <w:lsdException w:name="Colorful List Accent 6" w:uiPriority="72"/>
-    <w:lsdException w:name="Colorful Grid Accent 6" w:uiPriority="73"/>
-    <w:lsdException w:name="Subtle Emphasis" w:uiPriority="19" w:qFormat="1"/>
-    <w:lsdException w:name="Intense Emphasis" w:uiPriority="21" w:qFormat="1"/>
-    <w:lsdException w:name="Subtle Reference" w:uiPriority="31" w:qFormat="1"/>
-    <w:lsdException w:name="Intense Reference" w:uiPriority="32" w:qFormat="1"/>
-    <w:lsdException w:name="Book Title" w:uiPriority="33" w:qFormat="1"/>
-    <w:lsdException w:name="Bibliography" w:semiHidden="1" w:uiPriority="37" w:unhideWhenUsed="1"/>
-    <w:lsdException w:name="TOC Heading" w:semiHidden="1" w:uiPriority="39" w:unhideWhenUsed="1" w:qFormat="1"/>
-    <w:lsdException w:name="Plain Table 1" w:uiPriority="41"/>
-    <w:lsdException w:name="Plain Table 2" w:uiPriority="42"/>
-    <w:lsdException w:name="Plain Table 3" w:uiPriority="43"/>
-    <w:lsdException w:name="Plain Table 4" w:uiPriority="44"/>
-    <w:lsdException w:name="Plain Table 5" w:uiPriority="45"/>
-    <w:lsdException w:name="Grid Table Light" w:uiPriority="40"/>
-    <w:lsdException w:name="Grid Table 1 Light" w:uiPriority="46"/>
-    <w:lsdException w:name="Grid Table 2" w:uiPriority="47"/>
-    <w:lsdException w:name="Grid Table 3" w:uiPriority="48"/>
-    <w:lsdException w:name="Grid Table 4" w:uiPriority="49"/>
-    <w:lsdException w:name="Grid Table 5 Dark" w:uiPriority="50"/>
-    <w:lsdException w:name="Grid Table 6 Colorful" w:uiPriority="51"/>
-    <w:lsdException w:name="Grid Table 7 Colorful" w:uiPriority="52"/>
-    <w:lsdException w:name="Grid Table 1 Light Accent 1" w:uiPriority="46"/>
-    <w:lsdException w:name="Grid Table 2 Accent 1" w:uiPriority="47"/>
-    <w:lsdException w:name="Grid Table 3 Accent 1" w:uiPriority="48"/>
-    <w:lsdException w:name="Grid Table 4 Accent 1" w:uiPriority="49"/>
-    <w:lsdException w:name="Grid Table 5 Dark Accent 1" w:uiPriority="50"/>
-    <w:lsdException w:name="Grid Table 6 Colorful Accent 1" w:uiPriority="51"/>
-    <w:lsdException w:name="Grid Table 7 Colorful Accent 1" w:uiPriority="52"/>
-    <w:lsdException w:name="Grid Table 1 Light Accent 2" w:uiPriority="46"/>
-    <w:lsdException w:name="Grid Table 2 Accent 2" w:uiPriority="47"/>
-    <w:lsdException w:name="Grid Table 3 Accent 2" w:uiPriority="48"/>
-    <w:lsdException w:name="Grid Table 4 Accent 2" w:uiPriority="49"/>
-    <w:lsdException w:name="Grid Table 5 Dark Accent 2" w:uiPriority="50"/>
-    <w:lsdException w:name="Grid Table 6 Colorful Accent 2" w:uiPriority="51"/>
-    <w:lsdException w:name="Grid Table 7 Colorful Accent 2" w:uiPriority="52"/>
-    <w:lsdException w:name="Grid Table 1 Light Accent 3" w:uiPriority="46"/>
-    <w:lsdException w:name="Grid Table 2 Accent 3" w:uiPriority="47"/>
-    <w:lsdException w:name="Grid Table 3 Accent 3" w:uiPriority="48"/>
-    <w:lsdException w:name="Grid Table 4 Accent 3" w:uiPriority="49"/>
-    <w:lsdException w:name="Grid Table 5 Dark Accent 3" w:uiPriority="50"/>
-    <w:lsdException w:name="Grid Table 6 Colorful Accent 3" w:uiPriority="51"/>
-    <w:lsdException w:name="Grid Table 7 Colorful Accent 3" w:uiPriority="52"/>
-    <w:lsdException w:name="Grid Table 1 Light Accent 4" w:uiPriority="46"/>
-    <w:lsdException w:name="Grid Table 2 Accent 4" w:uiPriority="47"/>
-    <w:lsdException w:name="Grid Table 3 Accent 4" w:uiPriority="48"/>
-    <w:lsdException w:name="Grid Table 4 Accent 4" w:uiPriority="49"/>
-    <w:lsdException w:name="Grid Table 5 Dark Accent 4" w:uiPriority="50"/>
-    <w:lsdException w:name="Grid Table 6 Colorful Accent 4" w:uiPriority="51"/>
-    <w:lsdException w:name="Grid Table 7 Colorful Accent 4" w:uiPriority="52"/>
-    <w:lsdException w:name="Grid Table 1 Light Accent 5" w:uiPriority="46"/>
-    <w:lsdException w:name="Grid Table 2 Accent 5" w:uiPriority="47"/>
-    <w:lsdException w:name="Grid Table 3 Accent 5" w:uiPriority="48"/>
-    <w:lsdException w:name="Grid Table 4 Accent 5" w:uiPriority="49"/>
-    <w:lsdException w:name="Grid Table 5 Dark Accent 5" w:uiPriority="50"/>
-    <w:lsdException w:name="Grid Table 6 Colorful Accent 5" w:uiPriority="51"/>
-    <w:lsdException w:name="Grid Table 7 Colorful Accent 5" w:uiPriority="52"/>
-    <w:lsdException w:name="Grid Table 1 Light Accent 6" w:uiPriority="46"/>
-    <w:lsdException w:name="Grid Table 2 Accent 6" w:uiPriority="47"/>
-    <w:lsdException w:name="Grid Table 3 Accent 6" w:uiPriority="48"/>
-    <w:lsdException w:name="Grid Table 4 Accent 6" w:uiPriority="49"/>
-    <w:lsdException w:name="Grid Table 5 Dark Accent 6" w:uiPriority="50"/>
-    <w:lsdException w:name="Grid Table 6 Colorful Accent 6" w:uiPriority="51"/>
-    <w:lsdException w:name="Grid Table 7 Colorful Accent 6" w:uiPriority="52"/>
-    <w:lsdException w:name="List Table 1 Light" w:uiPriority="46"/>
-    <w:lsdException w:name="List Table 2" w:uiPriority="47"/>
-    <w:lsdException w:name="List Table 3" w:uiPriority="48"/>
-    <w:lsdException w:name="List Table 4" w:uiPriority="49"/>
-    <w:lsdException w:name="List Table 5 Dark" w:uiPriority="50"/>
-    <w:lsdException w:name="List Table 6 Colorful" w:uiPriority="51"/>
-    <w:lsdException w:name="List Table 7 Colorful" w:uiPriority="52"/>
-    <w:lsdException w:name="List Table 1 Light Accent 1" w:uiPriority="46"/>
-    <w:lsdException w:name="List Table 2 Accent 1" w:uiPriority="47"/>
-    <w:lsdException w:name="List Table 3 Accent 1" w:uiPriority="48"/>
-    <w:lsdException w:name="List Table 4 Accent 1" w:uiPriority="49"/>
-    <w:lsdException w:name="List Table 5 Dark Accent 1" w:uiPriority="50"/>
-    <w:lsdException w:name="List Table 6 Colorful Accent 1" w:uiPriority="51"/>
-    <w:lsdException w:name="List Table 7 Colorful Accent 1" w:uiPriority="52"/>
-    <w:lsdException w:name="List Table 1 Light Accent 2" w:uiPriority="46"/>
-    <w:lsdException w:name="List Table 2 Accent 2" w:uiPriority="47"/>
-    <w:lsdException w:name="List Table 3 Accent 2" w:uiPriority="48"/>
-    <w:lsdException w:name="List Table 4 Accent 2" w:uiPriority="49"/>
-    <w:lsdException w:name="List Table 5 Dark Accent 2" w:uiPriority="50"/>
-    <w:lsdException w:name="List Table 6 Colorful Accent 2" w:uiPriority="51"/>
-    <w:lsdException w:name="List Table 7 Colorful Accent 2" w:uiPriority="52"/>
-    <w:lsdException w:name="List Table 1 Light Accent 3" w:uiPriority="46"/>
-    <w:lsdException w:name="List Table 2 Accent 3" w:uiPriority="47"/>
-    <w:lsdException w:name="List Table 3 Accent 3" w:uiPriority="48"/>
-    <w:lsdException w:name="List Table 4 Accent 3" w:uiPriority="49"/>
-    <w:lsdException w:name="List Table 5 Dark Accent 3" w:uiPriority="50"/>
-    <w:lsdException w:name="List Table 6 Colorful Accent 3" w:uiPriority="51"/>
-    <w:lsdException w:name="List Table 7 Colorful Accent 3" w:uiPriority="52"/>
-    <w:lsdException w:name="List Table 1 Light Accent 4" w:uiPriority="46"/>
-    <w:lsdException w:name="List Table 2 Accent 4" w:uiPriority="47"/>
-    <w:lsdException w:name="List Table 3 Accent 4" w:uiPriority="48"/>
-    <w:lsdException w:name="List Table 4 Accent 4" w:uiPriority="49"/>
-    <w:lsdException w:name="List Table 5 Dark Accent 4" w:uiPriority="50"/>
-    <w:lsdException w:name="List Table 6 Colorful Accent 4" w:uiPriority="51"/>
-    <w:lsdException w:name="List Table 7 Colorful Accent 4" w:uiPriority="52"/>
-    <w:lsdException w:name="List Table 1 Light Accent 5" w:uiPriority="46"/>
-    <w:lsdException w:name="List Table 2 Accent 5" w:uiPriority="47"/>
-    <w:lsdException w:name="List Table 3 Accent 5" w:uiPriority="48"/>
-    <w:lsdException w:name="List Table 4 Accent 5" w:uiPriority="49"/>
-    <w:lsdException w:name="List Table 5 Dark Accent 5" w:uiPriority="50"/>
-    <w:lsdException w:name="List Table 6 Colorful Accent 5" w:uiPriority="51"/>
-    <w:lsdException w:name="List Table 7 Colorful Accent 5" w:uiPriority="52"/>
-    <w:lsdException w:name="List Table 1 Light Accent 6" w:uiPriority="46"/>
-    <w:lsdException w:name="List Table 2 Accent 6" w:uiPriority="47"/>
-    <w:lsdException w:name="List Table 3 Accent 6" w:uiPriority="48"/>
-    <w:lsdException w:name="List Table 4 Accent 6" w:uiPriority="49"/>
-    <w:lsdException w:name="List Table 5 Dark Accent 6" w:uiPriority="50"/>
-    <w:lsdException w:name="List Table 6 Colorful Accent 6" w:uiPriority="51"/>
-    <w:lsdException w:name="List Table 7 Colorful Accent 6" w:uiPriority="52"/>
-    <w:lsdException w:name="Mention" w:semiHidden="1" w:unhideWhenUsed="1"/>
-    <w:lsdException w:name="Smart Hyperlink" w:semiHidden="1" w:unhideWhenUsed="1"/>
-    <w:lsdException w:name="Hashtag" w:semiHidden="1" w:unhideWhenUsed="1"/>
-    <w:lsdException w:name="Unresolved Mention" w:semiHidden="1" w:unhideWhenUsed="1"/>
-    <w:lsdException w:name="Smart Link" w:semiHidden="1" w:unhideWhenUsed="1"/>
-  </w:latentStyles>
-  <w:style w:type="paragraph" w:default="1" w:styleId="Normal">
+  <w:style w:type="paragraph" w:styleId="P0" w:default="1">
     <w:name w:val="Normal"/>
     <w:qFormat/>
+    <w:pPr/>
+    <w:rPr/>
   </w:style>
-  <w:style w:type="character" w:default="1" w:styleId="DefaultParagraphFont">
+  <w:style w:type="character" w:styleId="C0" w:default="1">
     <w:name w:val="Default Paragraph Font"/>
-    <w:uiPriority w:val="1"/>
     <w:semiHidden/>
-    <w:unhideWhenUsed/>
+    <w:rPr/>
   </w:style>
-  <w:style w:type="table" w:default="1" w:styleId="TableNormal">
+  <w:style w:type="character" w:styleId="C1">
+    <w:name w:val="Line Number"/>
+    <w:basedOn w:val="C0"/>
+    <w:semiHidden/>
+    <w:rPr/>
+  </w:style>
+  <w:style w:type="character" w:styleId="C2">
+    <w:name w:val="Hyperlink"/>
+    <w:rPr>
+      <w:color w:val="0000FF"/>
+      <w:u w:val="single"/>
+    </w:rPr>
+  </w:style>
+  <w:style w:type="table" w:styleId="T0" w:default="1">
     <w:name w:val="Normal Table"/>
-    <w:uiPriority w:val="99"/>
     <w:semiHidden/>
-    <w:unhideWhenUsed/>
     <w:tblPr>
       <w:tblInd w:w="0" w:type="dxa"/>
       <w:tblCellMar>
@@ -2541,12 +2251,33 @@
         <w:right w:w="108" w:type="dxa"/>
       </w:tblCellMar>
     </w:tblPr>
+    <w:trPr/>
+    <w:tcPr/>
   </w:style>
-  <w:style w:type="numbering" w:default="1" w:styleId="NoList">
+  <w:style w:type="table" w:styleId="T1">
+    <w:name w:val="Table Simple 1"/>
+    <w:basedOn w:val="T0"/>
+    <w:tblPr>
+      <w:tblBorders>
+        <w:top w:val="single" w:sz="4" w:space="0" w:shadow="0" w:frame="0" w:color="000000"/>
+        <w:left w:val="single" w:sz="4" w:space="0" w:shadow="0" w:frame="0" w:color="000000"/>
+        <w:bottom w:val="single" w:sz="4" w:space="0" w:shadow="0" w:frame="0" w:color="000000"/>
+        <w:right w:val="single" w:sz="4" w:space="0" w:shadow="0" w:frame="0" w:color="000000"/>
+        <w:insideH w:val="single" w:sz="4" w:space="0" w:shadow="0" w:frame="0" w:color="000000"/>
+        <w:insideV w:val="single" w:sz="4" w:space="0" w:shadow="0" w:frame="0" w:color="000000"/>
+      </w:tblBorders>
+      <w:tblCellMar>
+        <w:top w:w="0" w:type="dxa"/>
+        <w:left w:w="108" w:type="dxa"/>
+        <w:bottom w:w="0" w:type="dxa"/>
+        <w:right w:w="108" w:type="dxa"/>
+      </w:tblCellMar>
+    </w:tblPr>
+    <w:trPr/>
+    <w:tcPr/>
+  </w:style>
+  <w:style w:type="numbering" w:styleId="N0">
     <w:name w:val="No List"/>
-    <w:uiPriority w:val="99"/>
-    <w:semiHidden/>
-    <w:unhideWhenUsed/>
   </w:style>
 </w:styles>
 </file>
@@ -2728,6 +2459,7 @@
             </a:gs>
           </a:gsLst>
           <a:lin ang="5400000" scaled="0"/>
+          <a:tileRect/>
         </a:gradFill>
         <a:gradFill rotWithShape="1">
           <a:gsLst>
@@ -2754,24 +2486,25 @@
             </a:gs>
           </a:gsLst>
           <a:lin ang="5400000" scaled="0"/>
+          <a:tileRect/>
         </a:gradFill>
       </a:fillStyleLst>
       <a:lnStyleLst>
-        <a:ln w="6350" cap="flat" cmpd="sng" algn="ctr">
+        <a:ln w="6350" cmpd="sng" algn="ctr">
           <a:solidFill>
             <a:schemeClr val="phClr"/>
           </a:solidFill>
           <a:prstDash val="solid"/>
           <a:miter lim="800000"/>
         </a:ln>
-        <a:ln w="12700" cap="flat" cmpd="sng" algn="ctr">
+        <a:ln w="12700" cmpd="sng" algn="ctr">
           <a:solidFill>
             <a:schemeClr val="phClr"/>
           </a:solidFill>
           <a:prstDash val="solid"/>
           <a:miter lim="800000"/>
         </a:ln>
-        <a:ln w="19050" cap="flat" cmpd="sng" algn="ctr">
+        <a:ln w="19050" cmpd="sng" algn="ctr">
           <a:solidFill>
             <a:schemeClr val="phClr"/>
           </a:solidFill>
@@ -2832,16 +2565,10 @@
             </a:gs>
           </a:gsLst>
           <a:lin ang="5400000" scaled="0"/>
+          <a:tileRect/>
         </a:gradFill>
       </a:bgFillStyleLst>
     </a:fmtScheme>
   </a:themeElements>
-  <a:objectDefaults/>
-  <a:extraClrSchemeLst/>
-  <a:extLst>
-    <a:ext uri="{05A4C25C-085E-4340-85A3-A5531E510DB2}">
-      <thm15:themeFamily xmlns:thm15="http://schemas.microsoft.com/office/thememl/2012/main" name="Office Theme" id="{62F939B6-93AF-4DB8-9C6B-D6C7DFDC589F}" vid="{4A3C46E8-61CC-4603-A589-7422A47A8E4A}"/>
-    </a:ext>
-  </a:extLst>
 </a:theme>
 </file>
</xml_diff>